<commit_message>
Update T21RS testing kit docs
</commit_message>
<xml_diff>
--- a/docs/T21RS_testing_plan.docx
+++ b/docs/T21RS_testing_plan.docx
@@ -1120,7 +1120,7 @@
           </w:tcPr>
           <w:p>
             <w:r>
-              <w:t>Queries 18–19 (ARRIVE reporting); calibration C1/C2; 2 wild-track questions; Tier-2 citation checks on own queries</w:t>
+              <w:t>Queries 18–19 (ARRIVE reporting); calibration C1/C2; 2 wild-track questions; Tier-2 citation checks on own queries; Deep Dive DD-6 (verbatim extraction)</w:t>
             </w:r>
           </w:p>
         </w:tc>
@@ -1288,7 +1288,7 @@
           </w:tcPr>
           <w:p>
             <w:r>
-              <w:t>Calibration C1/C2; 2 wild-track questions; absorbs queries if a scorer drops out</w:t>
+              <w:t>Calibration C1/C2; 2 wild-track questions; Deep Dive DD-4, DD-7, DD-8; absorbs queries if a scorer drops out</w:t>
             </w:r>
           </w:p>
         </w:tc>
@@ -1414,7 +1414,7 @@
           </w:tcPr>
           <w:p>
             <w:r>
-              <w:t>Calibration C1/C2; 2 wild-track questions; absorbs queries if a scorer drops out</w:t>
+              <w:t>Calibration C1/C2; 2 wild-track questions; Deep Dive DD-1 to DD-3 (suggestion triggers) and DD-5 (verbatim extraction); absorbs queries if a scorer drops out</w:t>
             </w:r>
           </w:p>
         </w:tc>

</xml_diff>